<commit_message>
fix(site): rework template, form, and print pages
Show blank templates as column lists with the guide's notes. Let tables
use the page width and size columns to their text. Add tick boxes and
text fields to the checklists, a fillable statement of applicability,
print icons, and Download my answers so typed answers can be kept.

Fixes #13

Co-Authored-By: Claude Sonnet 5.5 <noreply@anthropic.com>
Claude-Session: https://claude.ai/code/session_01XjzbFX8BVBbwU7jJMPUWj5
</commit_message>
<xml_diff>
--- a/site/docs/sam-toolkit/audit-and-review-checklist.docx
+++ b/site/docs/sam-toolkit/audit-and-review-checklist.docx
@@ -169,6 +169,23 @@
             <w:pPr>
               <w:spacing w:after="0"/>
             </w:pPr>
+            <w:sdt>
+              <w:sdtPr>
+                <w14:checkbox>
+                  <w14:checked w14:val="0"/>
+                  <w14:checkedState w14:val="2612" w14:font="MS Gothic"/>
+                  <w14:uncheckedState w14:val="2610" w14:font="MS Gothic"/>
+                </w14:checkbox>
+              </w:sdtPr>
+              <w:sdtContent>
+                <w:r>
+                  <w:rPr>
+                    <w:rFonts w:ascii="MS Gothic" w:eastAsia="MS Gothic" w:hAnsi="MS Gothic" w:hint="eastAsia"/>
+                  </w:rPr>
+                  <w:t>☐</w:t>
+                </w:r>
+              </w:sdtContent>
+            </w:sdt>
           </w:p>
         </w:tc>
         <w:tc>
@@ -221,6 +238,23 @@
             <w:pPr>
               <w:spacing w:after="0"/>
             </w:pPr>
+            <w:sdt>
+              <w:sdtPr>
+                <w14:checkbox>
+                  <w14:checked w14:val="0"/>
+                  <w14:checkedState w14:val="2612" w14:font="MS Gothic"/>
+                  <w14:uncheckedState w14:val="2610" w14:font="MS Gothic"/>
+                </w14:checkbox>
+              </w:sdtPr>
+              <w:sdtContent>
+                <w:r>
+                  <w:rPr>
+                    <w:rFonts w:ascii="MS Gothic" w:eastAsia="MS Gothic" w:hAnsi="MS Gothic" w:hint="eastAsia"/>
+                  </w:rPr>
+                  <w:t>☐</w:t>
+                </w:r>
+              </w:sdtContent>
+            </w:sdt>
           </w:p>
         </w:tc>
         <w:tc>
@@ -273,6 +307,23 @@
             <w:pPr>
               <w:spacing w:after="0"/>
             </w:pPr>
+            <w:sdt>
+              <w:sdtPr>
+                <w14:checkbox>
+                  <w14:checked w14:val="0"/>
+                  <w14:checkedState w14:val="2612" w14:font="MS Gothic"/>
+                  <w14:uncheckedState w14:val="2610" w14:font="MS Gothic"/>
+                </w14:checkbox>
+              </w:sdtPr>
+              <w:sdtContent>
+                <w:r>
+                  <w:rPr>
+                    <w:rFonts w:ascii="MS Gothic" w:eastAsia="MS Gothic" w:hAnsi="MS Gothic" w:hint="eastAsia"/>
+                  </w:rPr>
+                  <w:t>☐</w:t>
+                </w:r>
+              </w:sdtContent>
+            </w:sdt>
           </w:p>
         </w:tc>
         <w:tc>
@@ -325,6 +376,23 @@
             <w:pPr>
               <w:spacing w:after="0"/>
             </w:pPr>
+            <w:sdt>
+              <w:sdtPr>
+                <w14:checkbox>
+                  <w14:checked w14:val="0"/>
+                  <w14:checkedState w14:val="2612" w14:font="MS Gothic"/>
+                  <w14:uncheckedState w14:val="2610" w14:font="MS Gothic"/>
+                </w14:checkbox>
+              </w:sdtPr>
+              <w:sdtContent>
+                <w:r>
+                  <w:rPr>
+                    <w:rFonts w:ascii="MS Gothic" w:eastAsia="MS Gothic" w:hAnsi="MS Gothic" w:hint="eastAsia"/>
+                  </w:rPr>
+                  <w:t>☐</w:t>
+                </w:r>
+              </w:sdtContent>
+            </w:sdt>
           </w:p>
         </w:tc>
         <w:tc>
@@ -1122,6 +1190,23 @@
             <w:pPr>
               <w:spacing w:after="0"/>
             </w:pPr>
+            <w:sdt>
+              <w:sdtPr>
+                <w14:checkbox>
+                  <w14:checked w14:val="0"/>
+                  <w14:checkedState w14:val="2612" w14:font="MS Gothic"/>
+                  <w14:uncheckedState w14:val="2610" w14:font="MS Gothic"/>
+                </w14:checkbox>
+              </w:sdtPr>
+              <w:sdtContent>
+                <w:r>
+                  <w:rPr>
+                    <w:rFonts w:ascii="MS Gothic" w:eastAsia="MS Gothic" w:hAnsi="MS Gothic" w:hint="eastAsia"/>
+                  </w:rPr>
+                  <w:t>☐</w:t>
+                </w:r>
+              </w:sdtContent>
+            </w:sdt>
           </w:p>
         </w:tc>
         <w:tc>
@@ -1174,6 +1259,23 @@
             <w:pPr>
               <w:spacing w:after="0"/>
             </w:pPr>
+            <w:sdt>
+              <w:sdtPr>
+                <w14:checkbox>
+                  <w14:checked w14:val="0"/>
+                  <w14:checkedState w14:val="2612" w14:font="MS Gothic"/>
+                  <w14:uncheckedState w14:val="2610" w14:font="MS Gothic"/>
+                </w14:checkbox>
+              </w:sdtPr>
+              <w:sdtContent>
+                <w:r>
+                  <w:rPr>
+                    <w:rFonts w:ascii="MS Gothic" w:eastAsia="MS Gothic" w:hAnsi="MS Gothic" w:hint="eastAsia"/>
+                  </w:rPr>
+                  <w:t>☐</w:t>
+                </w:r>
+              </w:sdtContent>
+            </w:sdt>
           </w:p>
         </w:tc>
         <w:tc>
@@ -1226,6 +1328,23 @@
             <w:pPr>
               <w:spacing w:after="0"/>
             </w:pPr>
+            <w:sdt>
+              <w:sdtPr>
+                <w14:checkbox>
+                  <w14:checked w14:val="0"/>
+                  <w14:checkedState w14:val="2612" w14:font="MS Gothic"/>
+                  <w14:uncheckedState w14:val="2610" w14:font="MS Gothic"/>
+                </w14:checkbox>
+              </w:sdtPr>
+              <w:sdtContent>
+                <w:r>
+                  <w:rPr>
+                    <w:rFonts w:ascii="MS Gothic" w:eastAsia="MS Gothic" w:hAnsi="MS Gothic" w:hint="eastAsia"/>
+                  </w:rPr>
+                  <w:t>☐</w:t>
+                </w:r>
+              </w:sdtContent>
+            </w:sdt>
           </w:p>
         </w:tc>
         <w:tc>
@@ -1396,6 +1515,23 @@
             <w:pPr>
               <w:spacing w:after="0"/>
             </w:pPr>
+            <w:sdt>
+              <w:sdtPr>
+                <w14:checkbox>
+                  <w14:checked w14:val="0"/>
+                  <w14:checkedState w14:val="2612" w14:font="MS Gothic"/>
+                  <w14:uncheckedState w14:val="2610" w14:font="MS Gothic"/>
+                </w14:checkbox>
+              </w:sdtPr>
+              <w:sdtContent>
+                <w:r>
+                  <w:rPr>
+                    <w:rFonts w:ascii="MS Gothic" w:eastAsia="MS Gothic" w:hAnsi="MS Gothic" w:hint="eastAsia"/>
+                  </w:rPr>
+                  <w:t>☐</w:t>
+                </w:r>
+              </w:sdtContent>
+            </w:sdt>
           </w:p>
         </w:tc>
         <w:tc>
@@ -1448,6 +1584,23 @@
             <w:pPr>
               <w:spacing w:after="0"/>
             </w:pPr>
+            <w:sdt>
+              <w:sdtPr>
+                <w14:checkbox>
+                  <w14:checked w14:val="0"/>
+                  <w14:checkedState w14:val="2612" w14:font="MS Gothic"/>
+                  <w14:uncheckedState w14:val="2610" w14:font="MS Gothic"/>
+                </w14:checkbox>
+              </w:sdtPr>
+              <w:sdtContent>
+                <w:r>
+                  <w:rPr>
+                    <w:rFonts w:ascii="MS Gothic" w:eastAsia="MS Gothic" w:hAnsi="MS Gothic" w:hint="eastAsia"/>
+                  </w:rPr>
+                  <w:t>☐</w:t>
+                </w:r>
+              </w:sdtContent>
+            </w:sdt>
           </w:p>
         </w:tc>
         <w:tc>
@@ -1500,6 +1653,23 @@
             <w:pPr>
               <w:spacing w:after="0"/>
             </w:pPr>
+            <w:sdt>
+              <w:sdtPr>
+                <w14:checkbox>
+                  <w14:checked w14:val="0"/>
+                  <w14:checkedState w14:val="2612" w14:font="MS Gothic"/>
+                  <w14:uncheckedState w14:val="2610" w14:font="MS Gothic"/>
+                </w14:checkbox>
+              </w:sdtPr>
+              <w:sdtContent>
+                <w:r>
+                  <w:rPr>
+                    <w:rFonts w:ascii="MS Gothic" w:eastAsia="MS Gothic" w:hAnsi="MS Gothic" w:hint="eastAsia"/>
+                  </w:rPr>
+                  <w:t>☐</w:t>
+                </w:r>
+              </w:sdtContent>
+            </w:sdt>
           </w:p>
         </w:tc>
         <w:tc>
@@ -1552,6 +1722,23 @@
             <w:pPr>
               <w:spacing w:after="0"/>
             </w:pPr>
+            <w:sdt>
+              <w:sdtPr>
+                <w14:checkbox>
+                  <w14:checked w14:val="0"/>
+                  <w14:checkedState w14:val="2612" w14:font="MS Gothic"/>
+                  <w14:uncheckedState w14:val="2610" w14:font="MS Gothic"/>
+                </w14:checkbox>
+              </w:sdtPr>
+              <w:sdtContent>
+                <w:r>
+                  <w:rPr>
+                    <w:rFonts w:ascii="MS Gothic" w:eastAsia="MS Gothic" w:hAnsi="MS Gothic" w:hint="eastAsia"/>
+                  </w:rPr>
+                  <w:t>☐</w:t>
+                </w:r>
+              </w:sdtContent>
+            </w:sdt>
           </w:p>
         </w:tc>
         <w:tc>
@@ -1604,6 +1791,23 @@
             <w:pPr>
               <w:spacing w:after="0"/>
             </w:pPr>
+            <w:sdt>
+              <w:sdtPr>
+                <w14:checkbox>
+                  <w14:checked w14:val="0"/>
+                  <w14:checkedState w14:val="2612" w14:font="MS Gothic"/>
+                  <w14:uncheckedState w14:val="2610" w14:font="MS Gothic"/>
+                </w14:checkbox>
+              </w:sdtPr>
+              <w:sdtContent>
+                <w:r>
+                  <w:rPr>
+                    <w:rFonts w:ascii="MS Gothic" w:eastAsia="MS Gothic" w:hAnsi="MS Gothic" w:hint="eastAsia"/>
+                  </w:rPr>
+                  <w:t>☐</w:t>
+                </w:r>
+              </w:sdtContent>
+            </w:sdt>
           </w:p>
         </w:tc>
         <w:tc>
@@ -1656,6 +1860,23 @@
             <w:pPr>
               <w:spacing w:after="0"/>
             </w:pPr>
+            <w:sdt>
+              <w:sdtPr>
+                <w14:checkbox>
+                  <w14:checked w14:val="0"/>
+                  <w14:checkedState w14:val="2612" w14:font="MS Gothic"/>
+                  <w14:uncheckedState w14:val="2610" w14:font="MS Gothic"/>
+                </w14:checkbox>
+              </w:sdtPr>
+              <w:sdtContent>
+                <w:r>
+                  <w:rPr>
+                    <w:rFonts w:ascii="MS Gothic" w:eastAsia="MS Gothic" w:hAnsi="MS Gothic" w:hint="eastAsia"/>
+                  </w:rPr>
+                  <w:t>☐</w:t>
+                </w:r>
+              </w:sdtContent>
+            </w:sdt>
           </w:p>
         </w:tc>
         <w:tc>
@@ -1708,6 +1929,23 @@
             <w:pPr>
               <w:spacing w:after="0"/>
             </w:pPr>
+            <w:sdt>
+              <w:sdtPr>
+                <w14:checkbox>
+                  <w14:checked w14:val="0"/>
+                  <w14:checkedState w14:val="2612" w14:font="MS Gothic"/>
+                  <w14:uncheckedState w14:val="2610" w14:font="MS Gothic"/>
+                </w14:checkbox>
+              </w:sdtPr>
+              <w:sdtContent>
+                <w:r>
+                  <w:rPr>
+                    <w:rFonts w:ascii="MS Gothic" w:eastAsia="MS Gothic" w:hAnsi="MS Gothic" w:hint="eastAsia"/>
+                  </w:rPr>
+                  <w:t>☐</w:t>
+                </w:r>
+              </w:sdtContent>
+            </w:sdt>
           </w:p>
         </w:tc>
         <w:tc>
@@ -1760,6 +1998,23 @@
             <w:pPr>
               <w:spacing w:after="0"/>
             </w:pPr>
+            <w:sdt>
+              <w:sdtPr>
+                <w14:checkbox>
+                  <w14:checked w14:val="0"/>
+                  <w14:checkedState w14:val="2612" w14:font="MS Gothic"/>
+                  <w14:uncheckedState w14:val="2610" w14:font="MS Gothic"/>
+                </w14:checkbox>
+              </w:sdtPr>
+              <w:sdtContent>
+                <w:r>
+                  <w:rPr>
+                    <w:rFonts w:ascii="MS Gothic" w:eastAsia="MS Gothic" w:hAnsi="MS Gothic" w:hint="eastAsia"/>
+                  </w:rPr>
+                  <w:t>☐</w:t>
+                </w:r>
+              </w:sdtContent>
+            </w:sdt>
           </w:p>
         </w:tc>
         <w:tc>

</xml_diff>

<commit_message>
fix(site): rework template, form, and print pages (#14)
Fixes the document pages you flagged: renewal calendar, authorization
log, vendor register, asset record, license position, statement of
applicability, and the audit checklist.

- Blank CSV templates show their columns as a list, with the guide's
notes.
- Tables use the page width and size columns to their text.
- Checklists get tick boxes (Done, Prepared) and text fields (Notes,
Evidence).
- The statement of applicability is a fillable form with an in-scope
count and a CSV download of the answers.
- Print icons at the top and bottom right of every document page.
- Download my answers (Word) keeps typed answers; a note on each page
says the Word and Excel downloads are blank copies.

make test, make build, and make scan pass.

Fixes #13

🤖 Generated with [Claude Code](https://claude.com/claude-code)

https://claude.ai/code/session_01XjzbFX8BVBbwU7jJMPUWj5

---------

Co-authored-by: Claude Sonnet 5.5 <noreply@anthropic.com>
</commit_message>
<xml_diff>
--- a/site/docs/sam-toolkit/audit-and-review-checklist.docx
+++ b/site/docs/sam-toolkit/audit-and-review-checklist.docx
@@ -169,6 +169,23 @@
             <w:pPr>
               <w:spacing w:after="0"/>
             </w:pPr>
+            <w:sdt>
+              <w:sdtPr>
+                <w14:checkbox>
+                  <w14:checked w14:val="0"/>
+                  <w14:checkedState w14:val="2612" w14:font="MS Gothic"/>
+                  <w14:uncheckedState w14:val="2610" w14:font="MS Gothic"/>
+                </w14:checkbox>
+              </w:sdtPr>
+              <w:sdtContent>
+                <w:r>
+                  <w:rPr>
+                    <w:rFonts w:ascii="MS Gothic" w:eastAsia="MS Gothic" w:hAnsi="MS Gothic" w:hint="eastAsia"/>
+                  </w:rPr>
+                  <w:t>☐</w:t>
+                </w:r>
+              </w:sdtContent>
+            </w:sdt>
           </w:p>
         </w:tc>
         <w:tc>
@@ -221,6 +238,23 @@
             <w:pPr>
               <w:spacing w:after="0"/>
             </w:pPr>
+            <w:sdt>
+              <w:sdtPr>
+                <w14:checkbox>
+                  <w14:checked w14:val="0"/>
+                  <w14:checkedState w14:val="2612" w14:font="MS Gothic"/>
+                  <w14:uncheckedState w14:val="2610" w14:font="MS Gothic"/>
+                </w14:checkbox>
+              </w:sdtPr>
+              <w:sdtContent>
+                <w:r>
+                  <w:rPr>
+                    <w:rFonts w:ascii="MS Gothic" w:eastAsia="MS Gothic" w:hAnsi="MS Gothic" w:hint="eastAsia"/>
+                  </w:rPr>
+                  <w:t>☐</w:t>
+                </w:r>
+              </w:sdtContent>
+            </w:sdt>
           </w:p>
         </w:tc>
         <w:tc>
@@ -273,6 +307,23 @@
             <w:pPr>
               <w:spacing w:after="0"/>
             </w:pPr>
+            <w:sdt>
+              <w:sdtPr>
+                <w14:checkbox>
+                  <w14:checked w14:val="0"/>
+                  <w14:checkedState w14:val="2612" w14:font="MS Gothic"/>
+                  <w14:uncheckedState w14:val="2610" w14:font="MS Gothic"/>
+                </w14:checkbox>
+              </w:sdtPr>
+              <w:sdtContent>
+                <w:r>
+                  <w:rPr>
+                    <w:rFonts w:ascii="MS Gothic" w:eastAsia="MS Gothic" w:hAnsi="MS Gothic" w:hint="eastAsia"/>
+                  </w:rPr>
+                  <w:t>☐</w:t>
+                </w:r>
+              </w:sdtContent>
+            </w:sdt>
           </w:p>
         </w:tc>
         <w:tc>
@@ -325,6 +376,23 @@
             <w:pPr>
               <w:spacing w:after="0"/>
             </w:pPr>
+            <w:sdt>
+              <w:sdtPr>
+                <w14:checkbox>
+                  <w14:checked w14:val="0"/>
+                  <w14:checkedState w14:val="2612" w14:font="MS Gothic"/>
+                  <w14:uncheckedState w14:val="2610" w14:font="MS Gothic"/>
+                </w14:checkbox>
+              </w:sdtPr>
+              <w:sdtContent>
+                <w:r>
+                  <w:rPr>
+                    <w:rFonts w:ascii="MS Gothic" w:eastAsia="MS Gothic" w:hAnsi="MS Gothic" w:hint="eastAsia"/>
+                  </w:rPr>
+                  <w:t>☐</w:t>
+                </w:r>
+              </w:sdtContent>
+            </w:sdt>
           </w:p>
         </w:tc>
         <w:tc>
@@ -1122,6 +1190,23 @@
             <w:pPr>
               <w:spacing w:after="0"/>
             </w:pPr>
+            <w:sdt>
+              <w:sdtPr>
+                <w14:checkbox>
+                  <w14:checked w14:val="0"/>
+                  <w14:checkedState w14:val="2612" w14:font="MS Gothic"/>
+                  <w14:uncheckedState w14:val="2610" w14:font="MS Gothic"/>
+                </w14:checkbox>
+              </w:sdtPr>
+              <w:sdtContent>
+                <w:r>
+                  <w:rPr>
+                    <w:rFonts w:ascii="MS Gothic" w:eastAsia="MS Gothic" w:hAnsi="MS Gothic" w:hint="eastAsia"/>
+                  </w:rPr>
+                  <w:t>☐</w:t>
+                </w:r>
+              </w:sdtContent>
+            </w:sdt>
           </w:p>
         </w:tc>
         <w:tc>
@@ -1174,6 +1259,23 @@
             <w:pPr>
               <w:spacing w:after="0"/>
             </w:pPr>
+            <w:sdt>
+              <w:sdtPr>
+                <w14:checkbox>
+                  <w14:checked w14:val="0"/>
+                  <w14:checkedState w14:val="2612" w14:font="MS Gothic"/>
+                  <w14:uncheckedState w14:val="2610" w14:font="MS Gothic"/>
+                </w14:checkbox>
+              </w:sdtPr>
+              <w:sdtContent>
+                <w:r>
+                  <w:rPr>
+                    <w:rFonts w:ascii="MS Gothic" w:eastAsia="MS Gothic" w:hAnsi="MS Gothic" w:hint="eastAsia"/>
+                  </w:rPr>
+                  <w:t>☐</w:t>
+                </w:r>
+              </w:sdtContent>
+            </w:sdt>
           </w:p>
         </w:tc>
         <w:tc>
@@ -1226,6 +1328,23 @@
             <w:pPr>
               <w:spacing w:after="0"/>
             </w:pPr>
+            <w:sdt>
+              <w:sdtPr>
+                <w14:checkbox>
+                  <w14:checked w14:val="0"/>
+                  <w14:checkedState w14:val="2612" w14:font="MS Gothic"/>
+                  <w14:uncheckedState w14:val="2610" w14:font="MS Gothic"/>
+                </w14:checkbox>
+              </w:sdtPr>
+              <w:sdtContent>
+                <w:r>
+                  <w:rPr>
+                    <w:rFonts w:ascii="MS Gothic" w:eastAsia="MS Gothic" w:hAnsi="MS Gothic" w:hint="eastAsia"/>
+                  </w:rPr>
+                  <w:t>☐</w:t>
+                </w:r>
+              </w:sdtContent>
+            </w:sdt>
           </w:p>
         </w:tc>
         <w:tc>
@@ -1396,6 +1515,23 @@
             <w:pPr>
               <w:spacing w:after="0"/>
             </w:pPr>
+            <w:sdt>
+              <w:sdtPr>
+                <w14:checkbox>
+                  <w14:checked w14:val="0"/>
+                  <w14:checkedState w14:val="2612" w14:font="MS Gothic"/>
+                  <w14:uncheckedState w14:val="2610" w14:font="MS Gothic"/>
+                </w14:checkbox>
+              </w:sdtPr>
+              <w:sdtContent>
+                <w:r>
+                  <w:rPr>
+                    <w:rFonts w:ascii="MS Gothic" w:eastAsia="MS Gothic" w:hAnsi="MS Gothic" w:hint="eastAsia"/>
+                  </w:rPr>
+                  <w:t>☐</w:t>
+                </w:r>
+              </w:sdtContent>
+            </w:sdt>
           </w:p>
         </w:tc>
         <w:tc>
@@ -1448,6 +1584,23 @@
             <w:pPr>
               <w:spacing w:after="0"/>
             </w:pPr>
+            <w:sdt>
+              <w:sdtPr>
+                <w14:checkbox>
+                  <w14:checked w14:val="0"/>
+                  <w14:checkedState w14:val="2612" w14:font="MS Gothic"/>
+                  <w14:uncheckedState w14:val="2610" w14:font="MS Gothic"/>
+                </w14:checkbox>
+              </w:sdtPr>
+              <w:sdtContent>
+                <w:r>
+                  <w:rPr>
+                    <w:rFonts w:ascii="MS Gothic" w:eastAsia="MS Gothic" w:hAnsi="MS Gothic" w:hint="eastAsia"/>
+                  </w:rPr>
+                  <w:t>☐</w:t>
+                </w:r>
+              </w:sdtContent>
+            </w:sdt>
           </w:p>
         </w:tc>
         <w:tc>
@@ -1500,6 +1653,23 @@
             <w:pPr>
               <w:spacing w:after="0"/>
             </w:pPr>
+            <w:sdt>
+              <w:sdtPr>
+                <w14:checkbox>
+                  <w14:checked w14:val="0"/>
+                  <w14:checkedState w14:val="2612" w14:font="MS Gothic"/>
+                  <w14:uncheckedState w14:val="2610" w14:font="MS Gothic"/>
+                </w14:checkbox>
+              </w:sdtPr>
+              <w:sdtContent>
+                <w:r>
+                  <w:rPr>
+                    <w:rFonts w:ascii="MS Gothic" w:eastAsia="MS Gothic" w:hAnsi="MS Gothic" w:hint="eastAsia"/>
+                  </w:rPr>
+                  <w:t>☐</w:t>
+                </w:r>
+              </w:sdtContent>
+            </w:sdt>
           </w:p>
         </w:tc>
         <w:tc>
@@ -1552,6 +1722,23 @@
             <w:pPr>
               <w:spacing w:after="0"/>
             </w:pPr>
+            <w:sdt>
+              <w:sdtPr>
+                <w14:checkbox>
+                  <w14:checked w14:val="0"/>
+                  <w14:checkedState w14:val="2612" w14:font="MS Gothic"/>
+                  <w14:uncheckedState w14:val="2610" w14:font="MS Gothic"/>
+                </w14:checkbox>
+              </w:sdtPr>
+              <w:sdtContent>
+                <w:r>
+                  <w:rPr>
+                    <w:rFonts w:ascii="MS Gothic" w:eastAsia="MS Gothic" w:hAnsi="MS Gothic" w:hint="eastAsia"/>
+                  </w:rPr>
+                  <w:t>☐</w:t>
+                </w:r>
+              </w:sdtContent>
+            </w:sdt>
           </w:p>
         </w:tc>
         <w:tc>
@@ -1604,6 +1791,23 @@
             <w:pPr>
               <w:spacing w:after="0"/>
             </w:pPr>
+            <w:sdt>
+              <w:sdtPr>
+                <w14:checkbox>
+                  <w14:checked w14:val="0"/>
+                  <w14:checkedState w14:val="2612" w14:font="MS Gothic"/>
+                  <w14:uncheckedState w14:val="2610" w14:font="MS Gothic"/>
+                </w14:checkbox>
+              </w:sdtPr>
+              <w:sdtContent>
+                <w:r>
+                  <w:rPr>
+                    <w:rFonts w:ascii="MS Gothic" w:eastAsia="MS Gothic" w:hAnsi="MS Gothic" w:hint="eastAsia"/>
+                  </w:rPr>
+                  <w:t>☐</w:t>
+                </w:r>
+              </w:sdtContent>
+            </w:sdt>
           </w:p>
         </w:tc>
         <w:tc>
@@ -1656,6 +1860,23 @@
             <w:pPr>
               <w:spacing w:after="0"/>
             </w:pPr>
+            <w:sdt>
+              <w:sdtPr>
+                <w14:checkbox>
+                  <w14:checked w14:val="0"/>
+                  <w14:checkedState w14:val="2612" w14:font="MS Gothic"/>
+                  <w14:uncheckedState w14:val="2610" w14:font="MS Gothic"/>
+                </w14:checkbox>
+              </w:sdtPr>
+              <w:sdtContent>
+                <w:r>
+                  <w:rPr>
+                    <w:rFonts w:ascii="MS Gothic" w:eastAsia="MS Gothic" w:hAnsi="MS Gothic" w:hint="eastAsia"/>
+                  </w:rPr>
+                  <w:t>☐</w:t>
+                </w:r>
+              </w:sdtContent>
+            </w:sdt>
           </w:p>
         </w:tc>
         <w:tc>
@@ -1708,6 +1929,23 @@
             <w:pPr>
               <w:spacing w:after="0"/>
             </w:pPr>
+            <w:sdt>
+              <w:sdtPr>
+                <w14:checkbox>
+                  <w14:checked w14:val="0"/>
+                  <w14:checkedState w14:val="2612" w14:font="MS Gothic"/>
+                  <w14:uncheckedState w14:val="2610" w14:font="MS Gothic"/>
+                </w14:checkbox>
+              </w:sdtPr>
+              <w:sdtContent>
+                <w:r>
+                  <w:rPr>
+                    <w:rFonts w:ascii="MS Gothic" w:eastAsia="MS Gothic" w:hAnsi="MS Gothic" w:hint="eastAsia"/>
+                  </w:rPr>
+                  <w:t>☐</w:t>
+                </w:r>
+              </w:sdtContent>
+            </w:sdt>
           </w:p>
         </w:tc>
         <w:tc>
@@ -1760,6 +1998,23 @@
             <w:pPr>
               <w:spacing w:after="0"/>
             </w:pPr>
+            <w:sdt>
+              <w:sdtPr>
+                <w14:checkbox>
+                  <w14:checked w14:val="0"/>
+                  <w14:checkedState w14:val="2612" w14:font="MS Gothic"/>
+                  <w14:uncheckedState w14:val="2610" w14:font="MS Gothic"/>
+                </w14:checkbox>
+              </w:sdtPr>
+              <w:sdtContent>
+                <w:r>
+                  <w:rPr>
+                    <w:rFonts w:ascii="MS Gothic" w:eastAsia="MS Gothic" w:hAnsi="MS Gothic" w:hint="eastAsia"/>
+                  </w:rPr>
+                  <w:t>☐</w:t>
+                </w:r>
+              </w:sdtContent>
+            </w:sdt>
           </w:p>
         </w:tc>
         <w:tc>

</xml_diff>